<commit_message>
v10.17 (2026-10-07): manual para el sistema en operacion, con diagramas BPMN intercalados
Co-Authored-By: Claude Sonnet 5.5 <noreply@anthropic.com>
</commit_message>
<xml_diff>
--- a/manual/Manual de procedimientos - Bitacora de Obra.docx
+++ b/manual/Manual de procedimientos - Bitacora de Obra.docx
@@ -94,7 +94,7 @@
           <w:color w:val="55657A"/>
           <w:sz w:val="20"/>
         </w:rPr>
-        <w:t>Versión de la herramienta: v10.15 · 2026-10-07</w:t>
+        <w:t>Versión de la herramienta: v10.17 · 2026-10-07</w:t>
       </w:r>
     </w:p>
     <w:p>
@@ -111,7 +111,7 @@
           <w:b w:val="0"/>
           <w:i w:val="0"/>
         </w:rPr>
-        <w:t>Para quién es: Inspectores Fiscales (IF) y asesorías (AIF), Validadores / Jefes de Departamento, Administradores del sistema y Gabinete. Cada capítulo explica, paso a paso, qué hace cada perfil.</w:t>
+        <w:t>Para quién es: Inspectores Fiscales (IF) y asesorías (AIF), Validadores / Jefes de Departamento, Administradores del sistema y Gabinete. Cada capítulo explica, paso a paso, qué hace cada perfil, e incluye los diagramas del flujo de trabajo (BPMN) del proceso que se describe.</w:t>
       </w:r>
     </w:p>
     <w:tbl>
@@ -134,10 +134,10 @@
               <w:rPr>
                 <w:b/>
               </w:rPr>
-              <w:t xml:space="preserve">Antes de empezar: </w:t>
+              <w:t xml:space="preserve">Cómo leer este manual: </w:t>
             </w:r>
             <w:r>
-              <w:t>Si abres la Bitácora sin conexión al servidor, funciona en "modo local": los datos quedan solo en tu navegador y son de ejemplo. Antes de usarla con datos reales hay que contar con el servidor (ver capítulo 2).</w:t>
+              <w:t>Los nombres de pestañas y botones son los que verás en pantalla. Los diagramas de flujo van en hojas horizontales; cada uno se divide en dos partes para que se lea bien impreso.</w:t>
             </w:r>
           </w:p>
         </w:tc>
@@ -662,9 +662,172 @@
       </w:r>
     </w:p>
     <w:p>
+      <w:pPr>
+        <w:pStyle w:val="Heading2"/>
+      </w:pPr>
+      <w:r>
+        <w:t>1.3 Visión general del flujo</w:t>
+      </w:r>
+    </w:p>
+    <w:p>
+      <w:r>
+        <w:rPr>
+          <w:b w:val="0"/>
+          <w:i w:val="0"/>
+        </w:rPr>
+        <w:t>El Administrador deja listos los contratos, sectores y perfiles. El IF reporta; el sistema registra la solicitud y avisa al Validador; el Validador aprueba o rechaza; lo aprobado se vuelve dato oficial y queda disponible para Gabinete. Si se rechaza, el IF ve el motivo y puede reportar de nuevo. Las problemáticas no requieren aprobación: el Validador solo decide si publica una alerta a Gabinete.</w:t>
+      </w:r>
+    </w:p>
+    <w:p>
+      <w:pPr>
+        <w:sectPr>
+          <w:headerReference w:type="default" r:id="rId9"/>
+          <w:footerReference w:type="default" r:id="rId10"/>
+          <w:pgSz w:w="12240" w:h="15840"/>
+          <w:pgMar w:top="1247" w:right="1247" w:bottom="1134" w:left="1247" w:header="720" w:footer="720" w:gutter="0"/>
+          <w:cols w:space="720"/>
+          <w:docGrid w:linePitch="360"/>
+        </w:sectPr>
+      </w:pPr>
+    </w:p>
+    <w:p>
+      <w:pPr>
+        <w:pStyle w:val="Heading2"/>
+      </w:pPr>
+      <w:r>
+        <w:t>Diagrama general: Bitácora de Obra</w:t>
+      </w:r>
+    </w:p>
+    <w:p>
+      <w:r>
+        <w:rPr>
+          <w:b w:val="0"/>
+          <w:i/>
+          <w:sz w:val="19"/>
+        </w:rPr>
+        <w:t>Quién hace qué, cómo se aprueba la información y qué ve Gabinete. Los capítulos siguientes detallan cada proceso.</w:t>
+      </w:r>
+    </w:p>
+    <w:p>
+      <w:pPr>
+        <w:jc w:val="center"/>
+      </w:pPr>
+      <w:r>
+        <w:drawing>
+          <wp:inline xmlns:a="http://schemas.openxmlformats.org/drawingml/2006/main" xmlns:pic="http://schemas.openxmlformats.org/drawingml/2006/picture">
+            <wp:extent cx="5814281" cy="5472000"/>
+            <wp:docPr id="2" name="Picture 2"/>
+            <wp:cNvGraphicFramePr>
+              <a:graphicFrameLocks noChangeAspect="1"/>
+            </wp:cNvGraphicFramePr>
+            <a:graphic>
+              <a:graphicData uri="http://schemas.openxmlformats.org/drawingml/2006/picture">
+                <pic:pic>
+                  <pic:nvPicPr>
+                    <pic:cNvPr id="0" name="05_mapa_general_a.png"/>
+                    <pic:cNvPicPr/>
+                  </pic:nvPicPr>
+                  <pic:blipFill>
+                    <a:blip r:embed="rId12"/>
+                    <a:stretch>
+                      <a:fillRect/>
+                    </a:stretch>
+                  </pic:blipFill>
+                  <pic:spPr>
+                    <a:xfrm>
+                      <a:off x="0" y="0"/>
+                      <a:ext cx="5814281" cy="5472000"/>
+                    </a:xfrm>
+                    <a:prstGeom prst="rect"/>
+                  </pic:spPr>
+                </pic:pic>
+              </a:graphicData>
+            </a:graphic>
+          </wp:inline>
+        </w:drawing>
+      </w:r>
+    </w:p>
+    <w:p>
+      <w:pPr>
+        <w:jc w:val="center"/>
+      </w:pPr>
+      <w:r>
+        <w:rPr>
+          <w:b w:val="0"/>
+          <w:i w:val="0"/>
+          <w:color w:val="55657A"/>
+          <w:sz w:val="17"/>
+        </w:rPr>
+        <w:t>Parte 1 de 2 · el diagrama continúa en la página siguiente</w:t>
+      </w:r>
+    </w:p>
+    <w:p>
       <w:r>
         <w:br w:type="page"/>
       </w:r>
+    </w:p>
+    <w:p>
+      <w:pPr>
+        <w:jc w:val="center"/>
+      </w:pPr>
+      <w:r>
+        <w:drawing>
+          <wp:inline xmlns:a="http://schemas.openxmlformats.org/drawingml/2006/main" xmlns:pic="http://schemas.openxmlformats.org/drawingml/2006/picture">
+            <wp:extent cx="6908681" cy="5472000"/>
+            <wp:docPr id="3" name="Picture 3"/>
+            <wp:cNvGraphicFramePr>
+              <a:graphicFrameLocks noChangeAspect="1"/>
+            </wp:cNvGraphicFramePr>
+            <a:graphic>
+              <a:graphicData uri="http://schemas.openxmlformats.org/drawingml/2006/picture">
+                <pic:pic>
+                  <pic:nvPicPr>
+                    <pic:cNvPr id="0" name="05_mapa_general_b.png"/>
+                    <pic:cNvPicPr/>
+                  </pic:nvPicPr>
+                  <pic:blipFill>
+                    <a:blip r:embed="rId13"/>
+                    <a:stretch>
+                      <a:fillRect/>
+                    </a:stretch>
+                  </pic:blipFill>
+                  <pic:spPr>
+                    <a:xfrm>
+                      <a:off x="0" y="0"/>
+                      <a:ext cx="6908681" cy="5472000"/>
+                    </a:xfrm>
+                    <a:prstGeom prst="rect"/>
+                  </pic:spPr>
+                </pic:pic>
+              </a:graphicData>
+            </a:graphic>
+          </wp:inline>
+        </w:drawing>
+      </w:r>
+    </w:p>
+    <w:p>
+      <w:pPr>
+        <w:jc w:val="center"/>
+      </w:pPr>
+      <w:r>
+        <w:rPr>
+          <w:b w:val="0"/>
+          <w:i w:val="0"/>
+          <w:color w:val="55657A"/>
+          <w:sz w:val="17"/>
+        </w:rPr>
+        <w:t>Parte 2 de 2 · fin del diagrama</w:t>
+      </w:r>
+    </w:p>
+    <w:p>
+      <w:pPr>
+        <w:sectPr>
+          <w:pgSz w:w="15840" w:h="12240" w:orient="landscape"/>
+          <w:pgMar w:top="1020" w:right="850" w:bottom="907" w:left="850" w:header="720" w:footer="720" w:gutter="0"/>
+          <w:cols w:space="720"/>
+          <w:docGrid w:linePitch="360"/>
+        </w:sectPr>
+      </w:pPr>
     </w:p>
     <w:p>
       <w:pPr>
@@ -679,7 +842,7 @@
         <w:pStyle w:val="Heading2"/>
       </w:pPr>
       <w:r>
-        <w:t>2.1 Abrir la herramienta</w:t>
+        <w:t>2.1 Entrar a la Bitácora</w:t>
       </w:r>
     </w:p>
     <w:p>
@@ -698,19 +861,19 @@
         <w:rPr>
           <w:b w:val="0"/>
         </w:rPr>
-        <w:t xml:space="preserve">Abre el archivo </w:t>
+        <w:t xml:space="preserve">Abre el enlace institucional de la </w:t>
       </w:r>
       <w:r>
         <w:rPr>
           <w:b/>
         </w:rPr>
-        <w:t>Bitácora de Obra.html</w:t>
+        <w:t>Bitácora de Obra</w:t>
       </w:r>
       <w:r>
         <w:rPr>
           <w:b w:val="0"/>
         </w:rPr>
-        <w:t xml:space="preserve"> con Chrome o Edge (doble clic). No requiere instalar nada.</w:t>
+        <w:t xml:space="preserve"> con Chrome o Edge.</w:t>
       </w:r>
     </w:p>
     <w:p>
@@ -729,19 +892,31 @@
         <w:rPr>
           <w:b w:val="0"/>
         </w:rPr>
-        <w:t xml:space="preserve">En la pantalla de ingreso elige tu perfil y presiona </w:t>
+        <w:t xml:space="preserve">Ingresa con tu cuenta institucional. La herramienta reconoce tu </w:t>
       </w:r>
       <w:r>
         <w:rPr>
           <w:b/>
         </w:rPr>
-        <w:t>Ingresar</w:t>
+        <w:t>perfil</w:t>
       </w:r>
       <w:r>
         <w:rPr>
           <w:b w:val="0"/>
         </w:rPr>
-        <w:t>.</w:t>
+        <w:t xml:space="preserve"> y los </w:t>
+      </w:r>
+      <w:r>
+        <w:rPr>
+          <w:b/>
+        </w:rPr>
+        <w:t>contratos</w:t>
+      </w:r>
+      <w:r>
+        <w:rPr>
+          <w:b w:val="0"/>
+        </w:rPr>
+        <w:t xml:space="preserve"> que el Administrador te asignó, y te lleva directo a tus pestañas.</w:t>
       </w:r>
     </w:p>
     <w:p>
@@ -760,19 +935,19 @@
         <w:rPr>
           <w:b w:val="0"/>
         </w:rPr>
-        <w:t xml:space="preserve">Arriba a la derecha verás tu perfil y, si corresponde, el selector </w:t>
+        <w:t xml:space="preserve">Arriba a la derecha ves tu nombre y tu perfil. Si tienes más de un contrato, aparece el selector de </w:t>
       </w:r>
       <w:r>
         <w:rPr>
           <w:b/>
         </w:rPr>
-        <w:t>Ver como</w:t>
+        <w:t>contrato activo</w:t>
       </w:r>
       <w:r>
         <w:rPr>
           <w:b w:val="0"/>
         </w:rPr>
-        <w:t xml:space="preserve"> (solo en modo local y para Administradores), que sirve para recorrer los otros perfiles.</w:t>
+        <w:t>.</w:t>
       </w:r>
     </w:p>
     <w:p>
@@ -804,311 +979,6 @@
           <w:b w:val="0"/>
         </w:rPr>
         <w:t>.</w:t>
-      </w:r>
-    </w:p>
-    <w:p>
-      <w:pPr>
-        <w:pStyle w:val="Heading2"/>
-      </w:pPr>
-      <w:r>
-        <w:t>2.2 Modo local y modo con servidor</w:t>
-      </w:r>
-    </w:p>
-    <w:tbl>
-      <w:tblPr>
-        <w:tblStyle w:val="TableGrid"/>
-        <w:tblW w:type="auto" w:w="0"/>
-        <w:jc w:val="center"/>
-        <w:tblLook w:firstColumn="1" w:firstRow="1" w:lastColumn="0" w:lastRow="0" w:noHBand="0" w:noVBand="1" w:val="04A0"/>
-      </w:tblPr>
-      <w:tblGrid>
-        <w:gridCol w:w="3249"/>
-        <w:gridCol w:w="3249"/>
-        <w:gridCol w:w="3249"/>
-      </w:tblGrid>
-      <w:tr>
-        <w:tc>
-          <w:tcPr>
-            <w:tcW w:type="dxa" w:w="1701"/>
-            <w:shd w:val="clear" w:color="auto" w:fill="1F3A5F"/>
-          </w:tcPr>
-          <w:p>
-            <w:pPr>
-              <w:spacing w:after="20"/>
-            </w:pPr>
-            <w:r>
-              <w:rPr>
-                <w:b/>
-                <w:color w:val="FFFFFF"/>
-                <w:sz w:val="19"/>
-              </w:rPr>
-            </w:r>
-          </w:p>
-        </w:tc>
-        <w:tc>
-          <w:tcPr>
-            <w:tcW w:type="dxa" w:w="3855"/>
-            <w:shd w:val="clear" w:color="auto" w:fill="1F3A5F"/>
-          </w:tcPr>
-          <w:p>
-            <w:pPr>
-              <w:spacing w:after="20"/>
-            </w:pPr>
-            <w:r>
-              <w:rPr>
-                <w:b/>
-                <w:color w:val="FFFFFF"/>
-                <w:sz w:val="19"/>
-              </w:rPr>
-              <w:t>Modo local (hoy)</w:t>
-            </w:r>
-          </w:p>
-        </w:tc>
-        <w:tc>
-          <w:tcPr>
-            <w:tcW w:type="dxa" w:w="3855"/>
-            <w:shd w:val="clear" w:color="auto" w:fill="1F3A5F"/>
-          </w:tcPr>
-          <w:p>
-            <w:pPr>
-              <w:spacing w:after="20"/>
-            </w:pPr>
-            <w:r>
-              <w:rPr>
-                <w:b/>
-                <w:color w:val="FFFFFF"/>
-                <w:sz w:val="19"/>
-              </w:rPr>
-              <w:t>Con servidor (objetivo)</w:t>
-            </w:r>
-          </w:p>
-        </w:tc>
-      </w:tr>
-      <w:tr>
-        <w:tc>
-          <w:tcPr>
-            <w:tcW w:type="dxa" w:w="1701"/>
-          </w:tcPr>
-          <w:p>
-            <w:pPr>
-              <w:spacing w:after="20"/>
-            </w:pPr>
-            <w:r>
-              <w:rPr>
-                <w:b w:val="0"/>
-                <w:sz w:val="19"/>
-              </w:rPr>
-              <w:t>Datos</w:t>
-            </w:r>
-          </w:p>
-        </w:tc>
-        <w:tc>
-          <w:tcPr>
-            <w:tcW w:type="dxa" w:w="3855"/>
-          </w:tcPr>
-          <w:p>
-            <w:pPr>
-              <w:spacing w:after="20"/>
-            </w:pPr>
-            <w:r>
-              <w:rPr>
-                <w:b w:val="0"/>
-                <w:sz w:val="19"/>
-              </w:rPr>
-              <w:t>Quedan solo en tu navegador y computador; son de ejemplo.</w:t>
-            </w:r>
-          </w:p>
-        </w:tc>
-        <w:tc>
-          <w:tcPr>
-            <w:tcW w:type="dxa" w:w="3855"/>
-          </w:tcPr>
-          <w:p>
-            <w:pPr>
-              <w:spacing w:after="20"/>
-            </w:pPr>
-            <w:r>
-              <w:rPr>
-                <w:b w:val="0"/>
-                <w:sz w:val="19"/>
-              </w:rPr>
-              <w:t>Se guardan en la base institucional y los ve cada persona según su perfil.</w:t>
-            </w:r>
-          </w:p>
-        </w:tc>
-      </w:tr>
-      <w:tr>
-        <w:tc>
-          <w:tcPr>
-            <w:tcW w:type="dxa" w:w="1701"/>
-          </w:tcPr>
-          <w:p>
-            <w:pPr>
-              <w:spacing w:after="20"/>
-            </w:pPr>
-            <w:r>
-              <w:rPr>
-                <w:b w:val="0"/>
-                <w:sz w:val="19"/>
-              </w:rPr>
-              <w:t>Quién usa</w:t>
-            </w:r>
-          </w:p>
-        </w:tc>
-        <w:tc>
-          <w:tcPr>
-            <w:tcW w:type="dxa" w:w="3855"/>
-          </w:tcPr>
-          <w:p>
-            <w:pPr>
-              <w:spacing w:after="20"/>
-            </w:pPr>
-            <w:r>
-              <w:rPr>
-                <w:b w:val="0"/>
-                <w:sz w:val="19"/>
-              </w:rPr>
-              <w:t>Una persona. Sirve para conocer y probar la herramienta.</w:t>
-            </w:r>
-          </w:p>
-        </w:tc>
-        <w:tc>
-          <w:tcPr>
-            <w:tcW w:type="dxa" w:w="3855"/>
-          </w:tcPr>
-          <w:p>
-            <w:pPr>
-              <w:spacing w:after="20"/>
-            </w:pPr>
-            <w:r>
-              <w:rPr>
-                <w:b w:val="0"/>
-                <w:sz w:val="19"/>
-              </w:rPr>
-              <w:t>Todos los perfiles a la vez.</w:t>
-            </w:r>
-          </w:p>
-        </w:tc>
-      </w:tr>
-      <w:tr>
-        <w:tc>
-          <w:tcPr>
-            <w:tcW w:type="dxa" w:w="1701"/>
-          </w:tcPr>
-          <w:p>
-            <w:pPr>
-              <w:spacing w:after="20"/>
-            </w:pPr>
-            <w:r>
-              <w:rPr>
-                <w:b w:val="0"/>
-                <w:sz w:val="19"/>
-              </w:rPr>
-              <w:t>Perfil</w:t>
-            </w:r>
-          </w:p>
-        </w:tc>
-        <w:tc>
-          <w:tcPr>
-            <w:tcW w:type="dxa" w:w="3855"/>
-          </w:tcPr>
-          <w:p>
-            <w:pPr>
-              <w:spacing w:after="20"/>
-            </w:pPr>
-            <w:r>
-              <w:rPr>
-                <w:b w:val="0"/>
-                <w:sz w:val="19"/>
-              </w:rPr>
-              <w:t>Lo eliges en pantalla (Ver como).</w:t>
-            </w:r>
-          </w:p>
-        </w:tc>
-        <w:tc>
-          <w:tcPr>
-            <w:tcW w:type="dxa" w:w="3855"/>
-          </w:tcPr>
-          <w:p>
-            <w:pPr>
-              <w:spacing w:after="20"/>
-            </w:pPr>
-            <w:r>
-              <w:rPr>
-                <w:b w:val="0"/>
-                <w:sz w:val="19"/>
-              </w:rPr>
-              <w:t>Lo asigna el Administrador. Sin perfil asignado no se puede entrar.</w:t>
-            </w:r>
-          </w:p>
-        </w:tc>
-      </w:tr>
-      <w:tr>
-        <w:tc>
-          <w:tcPr>
-            <w:tcW w:type="dxa" w:w="1701"/>
-          </w:tcPr>
-          <w:p>
-            <w:pPr>
-              <w:spacing w:after="20"/>
-            </w:pPr>
-            <w:r>
-              <w:rPr>
-                <w:b w:val="0"/>
-                <w:sz w:val="19"/>
-              </w:rPr>
-              <w:t>Aprobar lo propio</w:t>
-            </w:r>
-          </w:p>
-        </w:tc>
-        <w:tc>
-          <w:tcPr>
-            <w:tcW w:type="dxa" w:w="3855"/>
-          </w:tcPr>
-          <w:p>
-            <w:pPr>
-              <w:spacing w:after="20"/>
-            </w:pPr>
-            <w:r>
-              <w:rPr>
-                <w:b w:val="0"/>
-                <w:sz w:val="19"/>
-              </w:rPr>
-              <w:t>Permitido (es una sola persona).</w:t>
-            </w:r>
-          </w:p>
-        </w:tc>
-        <w:tc>
-          <w:tcPr>
-            <w:tcW w:type="dxa" w:w="3855"/>
-          </w:tcPr>
-          <w:p>
-            <w:pPr>
-              <w:spacing w:after="20"/>
-            </w:pPr>
-            <w:r>
-              <w:rPr>
-                <w:b w:val="0"/>
-                <w:sz w:val="19"/>
-              </w:rPr>
-              <w:t>No permitido: otra persona debe aprobar.</w:t>
-            </w:r>
-          </w:p>
-        </w:tc>
-      </w:tr>
-    </w:tbl>
-    <w:p>
-      <w:pPr>
-        <w:spacing w:after="40"/>
-      </w:pPr>
-    </w:p>
-    <w:p>
-      <w:r>
-        <w:rPr>
-          <w:b w:val="0"/>
-          <w:i w:val="0"/>
-        </w:rPr>
-        <w:t>En modo local, el botón **Restablecer datos de ejemplo** (barra superior) borra lo que cargaste y vuelve al estado inicial; pide presionarlo dos veces seguidas para confirmar.</w:t>
       </w:r>
     </w:p>
     <w:tbl>
@@ -1134,7 +1004,7 @@
               <w:t xml:space="preserve">Importante: </w:t>
             </w:r>
             <w:r>
-              <w:t>Cambiar de navegador o borrar los datos de navegación hace desaparecer lo cargado en modo local. Chrome y Edge no comparten datos entre sí.</w:t>
+              <w:t>Si ingresas y la herramienta dice que no tienes perfil, pide al Administrador que te lo asigne (ver 6.4). Sin perfil asignado no se puede entrar.</w:t>
             </w:r>
           </w:p>
         </w:tc>
@@ -1144,6 +1014,320 @@
       <w:pPr>
         <w:spacing w:after="40"/>
       </w:pPr>
+    </w:p>
+    <w:p>
+      <w:pPr>
+        <w:pStyle w:val="Heading2"/>
+      </w:pPr>
+      <w:r>
+        <w:t>2.2 Qué ve y qué puede hacer cada persona</w:t>
+      </w:r>
+    </w:p>
+    <w:tbl>
+      <w:tblPr>
+        <w:tblStyle w:val="TableGrid"/>
+        <w:tblW w:type="auto" w:w="0"/>
+        <w:jc w:val="center"/>
+        <w:tblLook w:firstColumn="1" w:firstRow="1" w:lastColumn="0" w:lastRow="0" w:noHBand="0" w:noVBand="1" w:val="04A0"/>
+      </w:tblPr>
+      <w:tblGrid>
+        <w:gridCol w:w="3249"/>
+        <w:gridCol w:w="3249"/>
+        <w:gridCol w:w="3249"/>
+      </w:tblGrid>
+      <w:tr>
+        <w:tc>
+          <w:tcPr>
+            <w:tcW w:type="dxa" w:w="2041"/>
+            <w:shd w:val="clear" w:color="auto" w:fill="1F3A5F"/>
+          </w:tcPr>
+          <w:p>
+            <w:pPr>
+              <w:spacing w:after="20"/>
+            </w:pPr>
+            <w:r>
+              <w:rPr>
+                <w:b/>
+                <w:color w:val="FFFFFF"/>
+                <w:sz w:val="19"/>
+              </w:rPr>
+              <w:t>Perfil</w:t>
+            </w:r>
+          </w:p>
+        </w:tc>
+        <w:tc>
+          <w:tcPr>
+            <w:tcW w:type="dxa" w:w="3628"/>
+            <w:shd w:val="clear" w:color="auto" w:fill="1F3A5F"/>
+          </w:tcPr>
+          <w:p>
+            <w:pPr>
+              <w:spacing w:after="20"/>
+            </w:pPr>
+            <w:r>
+              <w:rPr>
+                <w:b/>
+                <w:color w:val="FFFFFF"/>
+                <w:sz w:val="19"/>
+              </w:rPr>
+              <w:t>Ve</w:t>
+            </w:r>
+          </w:p>
+        </w:tc>
+        <w:tc>
+          <w:tcPr>
+            <w:tcW w:type="dxa" w:w="3742"/>
+            <w:shd w:val="clear" w:color="auto" w:fill="1F3A5F"/>
+          </w:tcPr>
+          <w:p>
+            <w:pPr>
+              <w:spacing w:after="20"/>
+            </w:pPr>
+            <w:r>
+              <w:rPr>
+                <w:b/>
+                <w:color w:val="FFFFFF"/>
+                <w:sz w:val="19"/>
+              </w:rPr>
+              <w:t>Puede hacer</w:t>
+            </w:r>
+          </w:p>
+        </w:tc>
+      </w:tr>
+      <w:tr>
+        <w:tc>
+          <w:tcPr>
+            <w:tcW w:type="dxa" w:w="2041"/>
+          </w:tcPr>
+          <w:p>
+            <w:pPr>
+              <w:spacing w:after="20"/>
+            </w:pPr>
+            <w:r>
+              <w:rPr>
+                <w:b w:val="0"/>
+                <w:sz w:val="19"/>
+              </w:rPr>
+              <w:t>IF / AIF</w:t>
+            </w:r>
+          </w:p>
+        </w:tc>
+        <w:tc>
+          <w:tcPr>
+            <w:tcW w:type="dxa" w:w="3628"/>
+          </w:tcPr>
+          <w:p>
+            <w:pPr>
+              <w:spacing w:after="20"/>
+            </w:pPr>
+            <w:r>
+              <w:rPr>
+                <w:b w:val="0"/>
+                <w:sz w:val="19"/>
+              </w:rPr>
+              <w:t>Solo los contratos que tiene asignados (titular y suplente).</w:t>
+            </w:r>
+          </w:p>
+        </w:tc>
+        <w:tc>
+          <w:tcPr>
+            <w:tcW w:type="dxa" w:w="3742"/>
+          </w:tcPr>
+          <w:p>
+            <w:pPr>
+              <w:spacing w:after="20"/>
+            </w:pPr>
+            <w:r>
+              <w:rPr>
+                <w:b w:val="0"/>
+                <w:sz w:val="19"/>
+              </w:rPr>
+              <w:t>Proponer avances, fechas de hitos y problemáticas; seguir sus solicitudes.</w:t>
+            </w:r>
+          </w:p>
+        </w:tc>
+      </w:tr>
+      <w:tr>
+        <w:tc>
+          <w:tcPr>
+            <w:tcW w:type="dxa" w:w="2041"/>
+          </w:tcPr>
+          <w:p>
+            <w:pPr>
+              <w:spacing w:after="20"/>
+            </w:pPr>
+            <w:r>
+              <w:rPr>
+                <w:b w:val="0"/>
+                <w:sz w:val="19"/>
+              </w:rPr>
+              <w:t>Validador / Jefe de Depto.</w:t>
+            </w:r>
+          </w:p>
+        </w:tc>
+        <w:tc>
+          <w:tcPr>
+            <w:tcW w:type="dxa" w:w="3628"/>
+          </w:tcPr>
+          <w:p>
+            <w:pPr>
+              <w:spacing w:after="20"/>
+            </w:pPr>
+            <w:r>
+              <w:rPr>
+                <w:b w:val="0"/>
+                <w:sz w:val="19"/>
+              </w:rPr>
+              <w:t>Los contratos de su alcance y las solicitudes de sus IF.</w:t>
+            </w:r>
+          </w:p>
+        </w:tc>
+        <w:tc>
+          <w:tcPr>
+            <w:tcW w:type="dxa" w:w="3742"/>
+          </w:tcPr>
+          <w:p>
+            <w:pPr>
+              <w:spacing w:after="20"/>
+            </w:pPr>
+            <w:r>
+              <w:rPr>
+                <w:b w:val="0"/>
+                <w:sz w:val="19"/>
+              </w:rPr>
+              <w:t>Aprobar o rechazar; publicar alertas a Gabinete.</w:t>
+            </w:r>
+          </w:p>
+        </w:tc>
+      </w:tr>
+      <w:tr>
+        <w:tc>
+          <w:tcPr>
+            <w:tcW w:type="dxa" w:w="2041"/>
+          </w:tcPr>
+          <w:p>
+            <w:pPr>
+              <w:spacing w:after="20"/>
+            </w:pPr>
+            <w:r>
+              <w:rPr>
+                <w:b w:val="0"/>
+                <w:sz w:val="19"/>
+              </w:rPr>
+              <w:t>Administrador</w:t>
+            </w:r>
+          </w:p>
+        </w:tc>
+        <w:tc>
+          <w:tcPr>
+            <w:tcW w:type="dxa" w:w="3628"/>
+          </w:tcPr>
+          <w:p>
+            <w:pPr>
+              <w:spacing w:after="20"/>
+            </w:pPr>
+            <w:r>
+              <w:rPr>
+                <w:b w:val="0"/>
+                <w:sz w:val="19"/>
+              </w:rPr>
+              <w:t>Todo, incluido el registro de cambios.</w:t>
+            </w:r>
+          </w:p>
+        </w:tc>
+        <w:tc>
+          <w:tcPr>
+            <w:tcW w:type="dxa" w:w="3742"/>
+          </w:tcPr>
+          <w:p>
+            <w:pPr>
+              <w:spacing w:after="20"/>
+            </w:pPr>
+            <w:r>
+              <w:rPr>
+                <w:b w:val="0"/>
+                <w:sz w:val="19"/>
+              </w:rPr>
+              <w:t>Cargar contratos, sectores, hitos y pesos; asignar perfiles.</w:t>
+            </w:r>
+          </w:p>
+        </w:tc>
+      </w:tr>
+      <w:tr>
+        <w:tc>
+          <w:tcPr>
+            <w:tcW w:type="dxa" w:w="2041"/>
+          </w:tcPr>
+          <w:p>
+            <w:pPr>
+              <w:spacing w:after="20"/>
+            </w:pPr>
+            <w:r>
+              <w:rPr>
+                <w:b w:val="0"/>
+                <w:sz w:val="19"/>
+              </w:rPr>
+              <w:t>Gabinete</w:t>
+            </w:r>
+          </w:p>
+        </w:tc>
+        <w:tc>
+          <w:tcPr>
+            <w:tcW w:type="dxa" w:w="3628"/>
+          </w:tcPr>
+          <w:p>
+            <w:pPr>
+              <w:spacing w:after="20"/>
+            </w:pPr>
+            <w:r>
+              <w:rPr>
+                <w:b w:val="0"/>
+                <w:sz w:val="19"/>
+              </w:rPr>
+              <w:t>Solo datos aprobados.</w:t>
+            </w:r>
+          </w:p>
+        </w:tc>
+        <w:tc>
+          <w:tcPr>
+            <w:tcW w:type="dxa" w:w="3742"/>
+          </w:tcPr>
+          <w:p>
+            <w:pPr>
+              <w:spacing w:after="20"/>
+            </w:pPr>
+            <w:r>
+              <w:rPr>
+                <w:b w:val="0"/>
+                <w:sz w:val="19"/>
+              </w:rPr>
+              <w:t>Consultar. No aprueba ni edita.</w:t>
+            </w:r>
+          </w:p>
+        </w:tc>
+      </w:tr>
+    </w:tbl>
+    <w:p>
+      <w:pPr>
+        <w:spacing w:after="40"/>
+      </w:pPr>
+    </w:p>
+    <w:p>
+      <w:pPr>
+        <w:pStyle w:val="Heading2"/>
+      </w:pPr>
+      <w:r>
+        <w:t>2.3 Avisos por correo</w:t>
+      </w:r>
+    </w:p>
+    <w:p>
+      <w:r>
+        <w:rPr>
+          <w:b w:val="0"/>
+          <w:i w:val="0"/>
+        </w:rPr>
+        <w:t>La Bitácora tiene una campanita 🔔 con los avisos dentro de la herramienta. Además, al enviar una solicitud o al decidirla, el botón **Avisar por correo** abre tu Outlook con el mensaje ya redactado (contrato, sector, hito, valores y comentario); tú lo revisas y lo envías. El destinatario es el correo del aprobador del contrato (al enviar) o el del IF autor (al decidir).</w:t>
+      </w:r>
     </w:p>
     <w:p>
       <w:pPr>
@@ -1544,6 +1728,155 @@
     </w:p>
     <w:p>
       <w:pPr>
+        <w:sectPr>
+          <w:pgSz w:w="12240" w:h="15840"/>
+          <w:pgMar w:top="1247" w:right="1247" w:bottom="1134" w:left="1247" w:header="720" w:footer="720" w:gutter="0"/>
+          <w:cols w:space="720"/>
+          <w:docGrid w:linePitch="360"/>
+        </w:sectPr>
+      </w:pPr>
+    </w:p>
+    <w:p>
+      <w:pPr>
+        <w:pStyle w:val="Heading2"/>
+      </w:pPr>
+      <w:r>
+        <w:t>Diagrama: reporte y aprobación de avance físico</w:t>
+      </w:r>
+    </w:p>
+    <w:p>
+      <w:r>
+        <w:rPr>
+          <w:b w:val="0"/>
+          <w:i/>
+          <w:sz w:val="19"/>
+        </w:rPr>
+        <w:t>Desde que el IF ingresa el avance hasta que el dato queda oficial y visible para Gabinete, o es rechazado con comentario.</w:t>
+      </w:r>
+    </w:p>
+    <w:p>
+      <w:pPr>
+        <w:jc w:val="center"/>
+      </w:pPr>
+      <w:r>
+        <w:drawing>
+          <wp:inline xmlns:a="http://schemas.openxmlformats.org/drawingml/2006/main" xmlns:pic="http://schemas.openxmlformats.org/drawingml/2006/picture">
+            <wp:extent cx="8694400" cy="5472000"/>
+            <wp:docPr id="4" name="Picture 4"/>
+            <wp:cNvGraphicFramePr>
+              <a:graphicFrameLocks noChangeAspect="1"/>
+            </wp:cNvGraphicFramePr>
+            <a:graphic>
+              <a:graphicData uri="http://schemas.openxmlformats.org/drawingml/2006/picture">
+                <pic:pic>
+                  <pic:nvPicPr>
+                    <pic:cNvPr id="0" name="01_avance_fisico_a.png"/>
+                    <pic:cNvPicPr/>
+                  </pic:nvPicPr>
+                  <pic:blipFill>
+                    <a:blip r:embed="rId14"/>
+                    <a:stretch>
+                      <a:fillRect/>
+                    </a:stretch>
+                  </pic:blipFill>
+                  <pic:spPr>
+                    <a:xfrm>
+                      <a:off x="0" y="0"/>
+                      <a:ext cx="8694400" cy="5472000"/>
+                    </a:xfrm>
+                    <a:prstGeom prst="rect"/>
+                  </pic:spPr>
+                </pic:pic>
+              </a:graphicData>
+            </a:graphic>
+          </wp:inline>
+        </w:drawing>
+      </w:r>
+    </w:p>
+    <w:p>
+      <w:pPr>
+        <w:jc w:val="center"/>
+      </w:pPr>
+      <w:r>
+        <w:rPr>
+          <w:b w:val="0"/>
+          <w:i w:val="0"/>
+          <w:color w:val="55657A"/>
+          <w:sz w:val="17"/>
+        </w:rPr>
+        <w:t>Parte 1 de 2 · el diagrama continúa en la página siguiente</w:t>
+      </w:r>
+    </w:p>
+    <w:p>
+      <w:r>
+        <w:br w:type="page"/>
+      </w:r>
+    </w:p>
+    <w:p>
+      <w:pPr>
+        <w:jc w:val="center"/>
+      </w:pPr>
+      <w:r>
+        <w:drawing>
+          <wp:inline xmlns:a="http://schemas.openxmlformats.org/drawingml/2006/main" xmlns:pic="http://schemas.openxmlformats.org/drawingml/2006/picture">
+            <wp:extent cx="8964000" cy="4870670"/>
+            <wp:docPr id="5" name="Picture 5"/>
+            <wp:cNvGraphicFramePr>
+              <a:graphicFrameLocks noChangeAspect="1"/>
+            </wp:cNvGraphicFramePr>
+            <a:graphic>
+              <a:graphicData uri="http://schemas.openxmlformats.org/drawingml/2006/picture">
+                <pic:pic>
+                  <pic:nvPicPr>
+                    <pic:cNvPr id="0" name="01_avance_fisico_b.png"/>
+                    <pic:cNvPicPr/>
+                  </pic:nvPicPr>
+                  <pic:blipFill>
+                    <a:blip r:embed="rId15"/>
+                    <a:stretch>
+                      <a:fillRect/>
+                    </a:stretch>
+                  </pic:blipFill>
+                  <pic:spPr>
+                    <a:xfrm>
+                      <a:off x="0" y="0"/>
+                      <a:ext cx="8964000" cy="4870670"/>
+                    </a:xfrm>
+                    <a:prstGeom prst="rect"/>
+                  </pic:spPr>
+                </pic:pic>
+              </a:graphicData>
+            </a:graphic>
+          </wp:inline>
+        </w:drawing>
+      </w:r>
+    </w:p>
+    <w:p>
+      <w:pPr>
+        <w:jc w:val="center"/>
+      </w:pPr>
+      <w:r>
+        <w:rPr>
+          <w:b w:val="0"/>
+          <w:i w:val="0"/>
+          <w:color w:val="55657A"/>
+          <w:sz w:val="17"/>
+        </w:rPr>
+        <w:t>Parte 2 de 2 · fin del diagrama</w:t>
+      </w:r>
+    </w:p>
+    <w:p>
+      <w:pPr>
+        <w:sectPr>
+          <w:pgSz w:w="15840" w:h="12240" w:orient="landscape"/>
+          <w:pgMar w:top="1020" w:right="850" w:bottom="907" w:left="850" w:header="720" w:footer="720" w:gutter="0"/>
+          <w:cols w:space="720"/>
+          <w:docGrid w:linePitch="360"/>
+        </w:sectPr>
+      </w:pPr>
+    </w:p>
+    <w:p>
+      <w:pPr>
         <w:pStyle w:val="Heading2"/>
       </w:pPr>
       <w:r>
@@ -1707,6 +2040,155 @@
     </w:p>
     <w:p>
       <w:pPr>
+        <w:sectPr>
+          <w:pgSz w:w="12240" w:h="15840"/>
+          <w:pgMar w:top="1247" w:right="1247" w:bottom="1134" w:left="1247" w:header="720" w:footer="720" w:gutter="0"/>
+          <w:cols w:space="720"/>
+          <w:docGrid w:linePitch="360"/>
+        </w:sectPr>
+      </w:pPr>
+    </w:p>
+    <w:p>
+      <w:pPr>
+        <w:pStyle w:val="Heading2"/>
+      </w:pPr>
+      <w:r>
+        <w:t>Diagrama: modificación de fechas de hitos desde el Gantt</w:t>
+      </w:r>
+    </w:p>
+    <w:p>
+      <w:r>
+        <w:rPr>
+          <w:b w:val="0"/>
+          <w:i/>
+          <w:sz w:val="19"/>
+        </w:rPr>
+        <w:t>Cómo una nueva fecha programada o una fecha real llega a ser oficial: validación, aprobación, actualización del hito, desvío y semáforo.</w:t>
+      </w:r>
+    </w:p>
+    <w:p>
+      <w:pPr>
+        <w:jc w:val="center"/>
+      </w:pPr>
+      <w:r>
+        <w:drawing>
+          <wp:inline xmlns:a="http://schemas.openxmlformats.org/drawingml/2006/main" xmlns:pic="http://schemas.openxmlformats.org/drawingml/2006/picture">
+            <wp:extent cx="8964000" cy="4809951"/>
+            <wp:docPr id="6" name="Picture 6"/>
+            <wp:cNvGraphicFramePr>
+              <a:graphicFrameLocks noChangeAspect="1"/>
+            </wp:cNvGraphicFramePr>
+            <a:graphic>
+              <a:graphicData uri="http://schemas.openxmlformats.org/drawingml/2006/picture">
+                <pic:pic>
+                  <pic:nvPicPr>
+                    <pic:cNvPr id="0" name="02_modificacion_hitos_a.png"/>
+                    <pic:cNvPicPr/>
+                  </pic:nvPicPr>
+                  <pic:blipFill>
+                    <a:blip r:embed="rId16"/>
+                    <a:stretch>
+                      <a:fillRect/>
+                    </a:stretch>
+                  </pic:blipFill>
+                  <pic:spPr>
+                    <a:xfrm>
+                      <a:off x="0" y="0"/>
+                      <a:ext cx="8964000" cy="4809951"/>
+                    </a:xfrm>
+                    <a:prstGeom prst="rect"/>
+                  </pic:spPr>
+                </pic:pic>
+              </a:graphicData>
+            </a:graphic>
+          </wp:inline>
+        </w:drawing>
+      </w:r>
+    </w:p>
+    <w:p>
+      <w:pPr>
+        <w:jc w:val="center"/>
+      </w:pPr>
+      <w:r>
+        <w:rPr>
+          <w:b w:val="0"/>
+          <w:i w:val="0"/>
+          <w:color w:val="55657A"/>
+          <w:sz w:val="17"/>
+        </w:rPr>
+        <w:t>Parte 1 de 2 · el diagrama continúa en la página siguiente</w:t>
+      </w:r>
+    </w:p>
+    <w:p>
+      <w:r>
+        <w:br w:type="page"/>
+      </w:r>
+    </w:p>
+    <w:p>
+      <w:pPr>
+        <w:jc w:val="center"/>
+      </w:pPr>
+      <w:r>
+        <w:drawing>
+          <wp:inline xmlns:a="http://schemas.openxmlformats.org/drawingml/2006/main" xmlns:pic="http://schemas.openxmlformats.org/drawingml/2006/picture">
+            <wp:extent cx="8964000" cy="4836163"/>
+            <wp:docPr id="7" name="Picture 7"/>
+            <wp:cNvGraphicFramePr>
+              <a:graphicFrameLocks noChangeAspect="1"/>
+            </wp:cNvGraphicFramePr>
+            <a:graphic>
+              <a:graphicData uri="http://schemas.openxmlformats.org/drawingml/2006/picture">
+                <pic:pic>
+                  <pic:nvPicPr>
+                    <pic:cNvPr id="0" name="02_modificacion_hitos_b.png"/>
+                    <pic:cNvPicPr/>
+                  </pic:nvPicPr>
+                  <pic:blipFill>
+                    <a:blip r:embed="rId17"/>
+                    <a:stretch>
+                      <a:fillRect/>
+                    </a:stretch>
+                  </pic:blipFill>
+                  <pic:spPr>
+                    <a:xfrm>
+                      <a:off x="0" y="0"/>
+                      <a:ext cx="8964000" cy="4836163"/>
+                    </a:xfrm>
+                    <a:prstGeom prst="rect"/>
+                  </pic:spPr>
+                </pic:pic>
+              </a:graphicData>
+            </a:graphic>
+          </wp:inline>
+        </w:drawing>
+      </w:r>
+    </w:p>
+    <w:p>
+      <w:pPr>
+        <w:jc w:val="center"/>
+      </w:pPr>
+      <w:r>
+        <w:rPr>
+          <w:b w:val="0"/>
+          <w:i w:val="0"/>
+          <w:color w:val="55657A"/>
+          <w:sz w:val="17"/>
+        </w:rPr>
+        <w:t>Parte 2 de 2 · fin del diagrama</w:t>
+      </w:r>
+    </w:p>
+    <w:p>
+      <w:pPr>
+        <w:sectPr>
+          <w:pgSz w:w="15840" w:h="12240" w:orient="landscape"/>
+          <w:pgMar w:top="1020" w:right="850" w:bottom="907" w:left="850" w:header="720" w:footer="720" w:gutter="0"/>
+          <w:cols w:space="720"/>
+          <w:docGrid w:linePitch="360"/>
+        </w:sectPr>
+      </w:pPr>
+    </w:p>
+    <w:p>
+      <w:pPr>
         <w:pStyle w:val="Heading2"/>
       </w:pPr>
       <w:r>
@@ -2323,9 +2805,153 @@
       </w:r>
     </w:p>
     <w:p>
+      <w:pPr>
+        <w:sectPr>
+          <w:pgSz w:w="12240" w:h="15840"/>
+          <w:pgMar w:top="1247" w:right="1247" w:bottom="1134" w:left="1247" w:header="720" w:footer="720" w:gutter="0"/>
+          <w:cols w:space="720"/>
+          <w:docGrid w:linePitch="360"/>
+        </w:sectPr>
+      </w:pPr>
+    </w:p>
+    <w:p>
+      <w:pPr>
+        <w:pStyle w:val="Heading2"/>
+      </w:pPr>
+      <w:r>
+        <w:t>Diagrama: gestión de problemáticas y alertas</w:t>
+      </w:r>
+    </w:p>
+    <w:p>
+      <w:r>
+        <w:rPr>
+          <w:b w:val="0"/>
+          <w:i/>
+          <w:sz w:val="19"/>
+        </w:rPr>
+        <w:t>Ciclo de una problemática (Detectado → En gestión → Escalado → Resuelto) y, en paralelo, la decisión del Validador de publicar una alerta.</w:t>
+      </w:r>
+    </w:p>
+    <w:p>
+      <w:pPr>
+        <w:jc w:val="center"/>
+      </w:pPr>
+      <w:r>
+        <w:drawing>
+          <wp:inline xmlns:a="http://schemas.openxmlformats.org/drawingml/2006/main" xmlns:pic="http://schemas.openxmlformats.org/drawingml/2006/picture">
+            <wp:extent cx="5543854" cy="5471999"/>
+            <wp:docPr id="8" name="Picture 8"/>
+            <wp:cNvGraphicFramePr>
+              <a:graphicFrameLocks noChangeAspect="1"/>
+            </wp:cNvGraphicFramePr>
+            <a:graphic>
+              <a:graphicData uri="http://schemas.openxmlformats.org/drawingml/2006/picture">
+                <pic:pic>
+                  <pic:nvPicPr>
+                    <pic:cNvPr id="0" name="03_problematicas_y_alertas_a.png"/>
+                    <pic:cNvPicPr/>
+                  </pic:nvPicPr>
+                  <pic:blipFill>
+                    <a:blip r:embed="rId18"/>
+                    <a:stretch>
+                      <a:fillRect/>
+                    </a:stretch>
+                  </pic:blipFill>
+                  <pic:spPr>
+                    <a:xfrm>
+                      <a:off x="0" y="0"/>
+                      <a:ext cx="5543854" cy="5471999"/>
+                    </a:xfrm>
+                    <a:prstGeom prst="rect"/>
+                  </pic:spPr>
+                </pic:pic>
+              </a:graphicData>
+            </a:graphic>
+          </wp:inline>
+        </w:drawing>
+      </w:r>
+    </w:p>
+    <w:p>
+      <w:pPr>
+        <w:jc w:val="center"/>
+      </w:pPr>
+      <w:r>
+        <w:rPr>
+          <w:b w:val="0"/>
+          <w:i w:val="0"/>
+          <w:color w:val="55657A"/>
+          <w:sz w:val="17"/>
+        </w:rPr>
+        <w:t>Parte 1 de 2 · el diagrama continúa en la página siguiente</w:t>
+      </w:r>
+    </w:p>
+    <w:p>
       <w:r>
         <w:br w:type="page"/>
       </w:r>
+    </w:p>
+    <w:p>
+      <w:pPr>
+        <w:jc w:val="center"/>
+      </w:pPr>
+      <w:r>
+        <w:drawing>
+          <wp:inline xmlns:a="http://schemas.openxmlformats.org/drawingml/2006/main" xmlns:pic="http://schemas.openxmlformats.org/drawingml/2006/picture">
+            <wp:extent cx="8964000" cy="4870670"/>
+            <wp:docPr id="9" name="Picture 9"/>
+            <wp:cNvGraphicFramePr>
+              <a:graphicFrameLocks noChangeAspect="1"/>
+            </wp:cNvGraphicFramePr>
+            <a:graphic>
+              <a:graphicData uri="http://schemas.openxmlformats.org/drawingml/2006/picture">
+                <pic:pic>
+                  <pic:nvPicPr>
+                    <pic:cNvPr id="0" name="03_problematicas_y_alertas_b.png"/>
+                    <pic:cNvPicPr/>
+                  </pic:nvPicPr>
+                  <pic:blipFill>
+                    <a:blip r:embed="rId19"/>
+                    <a:stretch>
+                      <a:fillRect/>
+                    </a:stretch>
+                  </pic:blipFill>
+                  <pic:spPr>
+                    <a:xfrm>
+                      <a:off x="0" y="0"/>
+                      <a:ext cx="8964000" cy="4870670"/>
+                    </a:xfrm>
+                    <a:prstGeom prst="rect"/>
+                  </pic:spPr>
+                </pic:pic>
+              </a:graphicData>
+            </a:graphic>
+          </wp:inline>
+        </w:drawing>
+      </w:r>
+    </w:p>
+    <w:p>
+      <w:pPr>
+        <w:jc w:val="center"/>
+      </w:pPr>
+      <w:r>
+        <w:rPr>
+          <w:b w:val="0"/>
+          <w:i w:val="0"/>
+          <w:color w:val="55657A"/>
+          <w:sz w:val="17"/>
+        </w:rPr>
+        <w:t>Parte 2 de 2 · fin del diagrama</w:t>
+      </w:r>
+    </w:p>
+    <w:p>
+      <w:pPr>
+        <w:sectPr>
+          <w:pgSz w:w="15840" w:h="12240" w:orient="landscape"/>
+          <w:pgMar w:top="1020" w:right="850" w:bottom="907" w:left="850" w:header="720" w:footer="720" w:gutter="0"/>
+          <w:cols w:space="720"/>
+          <w:docGrid w:linePitch="360"/>
+        </w:sectPr>
+      </w:pPr>
     </w:p>
     <w:p>
       <w:pPr>
@@ -3794,10 +4420,163 @@
     </w:p>
     <w:p>
       <w:pPr>
+        <w:sectPr>
+          <w:pgSz w:w="12240" w:h="15840"/>
+          <w:pgMar w:top="1247" w:right="1247" w:bottom="1134" w:left="1247" w:header="720" w:footer="720" w:gutter="0"/>
+          <w:cols w:space="720"/>
+          <w:docGrid w:linePitch="360"/>
+        </w:sectPr>
+      </w:pPr>
+    </w:p>
+    <w:p>
+      <w:pPr>
         <w:pStyle w:val="Heading2"/>
       </w:pPr>
       <w:r>
+        <w:t>Diagrama: carga de contratos, subsectores y permisos</w:t>
+      </w:r>
+    </w:p>
+    <w:p>
+      <w:r>
+        <w:rPr>
+          <w:b w:val="0"/>
+          <w:i/>
+          <w:sz w:val="19"/>
+        </w:rPr>
+        <w:t>Plantilla, validación y vista previa de la carga por Excel; luego la asignación de perfiles y contratos.</w:t>
+      </w:r>
+    </w:p>
+    <w:p>
+      <w:pPr>
+        <w:jc w:val="center"/>
+      </w:pPr>
+      <w:r>
+        <w:drawing>
+          <wp:inline xmlns:a="http://schemas.openxmlformats.org/drawingml/2006/main" xmlns:pic="http://schemas.openxmlformats.org/drawingml/2006/picture">
+            <wp:extent cx="7920000" cy="2340887"/>
+            <wp:docPr id="10" name="Picture 10"/>
+            <wp:cNvGraphicFramePr>
+              <a:graphicFrameLocks noChangeAspect="1"/>
+            </wp:cNvGraphicFramePr>
+            <a:graphic>
+              <a:graphicData uri="http://schemas.openxmlformats.org/drawingml/2006/picture">
+                <pic:pic>
+                  <pic:nvPicPr>
+                    <pic:cNvPr id="0" name="04_carga_y_permisos_admin_a.png"/>
+                    <pic:cNvPicPr/>
+                  </pic:nvPicPr>
+                  <pic:blipFill>
+                    <a:blip r:embed="rId20"/>
+                    <a:stretch>
+                      <a:fillRect/>
+                    </a:stretch>
+                  </pic:blipFill>
+                  <pic:spPr>
+                    <a:xfrm>
+                      <a:off x="0" y="0"/>
+                      <a:ext cx="7920000" cy="2340887"/>
+                    </a:xfrm>
+                    <a:prstGeom prst="rect"/>
+                  </pic:spPr>
+                </pic:pic>
+              </a:graphicData>
+            </a:graphic>
+          </wp:inline>
+        </w:drawing>
+      </w:r>
+    </w:p>
+    <w:p>
+      <w:pPr>
+        <w:jc w:val="center"/>
+      </w:pPr>
+      <w:r>
+        <w:rPr>
+          <w:b w:val="0"/>
+          <w:i w:val="0"/>
+          <w:color w:val="55657A"/>
+          <w:sz w:val="17"/>
+        </w:rPr>
+        <w:t>Parte 1 de 2 · el diagrama continúa más abajo</w:t>
+      </w:r>
+    </w:p>
+    <w:p>
+      <w:pPr>
+        <w:jc w:val="center"/>
+      </w:pPr>
+      <w:r>
+        <w:drawing>
+          <wp:inline xmlns:a="http://schemas.openxmlformats.org/drawingml/2006/main" xmlns:pic="http://schemas.openxmlformats.org/drawingml/2006/picture">
+            <wp:extent cx="7920000" cy="2308041"/>
+            <wp:docPr id="11" name="Picture 11"/>
+            <wp:cNvGraphicFramePr>
+              <a:graphicFrameLocks noChangeAspect="1"/>
+            </wp:cNvGraphicFramePr>
+            <a:graphic>
+              <a:graphicData uri="http://schemas.openxmlformats.org/drawingml/2006/picture">
+                <pic:pic>
+                  <pic:nvPicPr>
+                    <pic:cNvPr id="0" name="04_carga_y_permisos_admin_b.png"/>
+                    <pic:cNvPicPr/>
+                  </pic:nvPicPr>
+                  <pic:blipFill>
+                    <a:blip r:embed="rId21"/>
+                    <a:stretch>
+                      <a:fillRect/>
+                    </a:stretch>
+                  </pic:blipFill>
+                  <pic:spPr>
+                    <a:xfrm>
+                      <a:off x="0" y="0"/>
+                      <a:ext cx="7920000" cy="2308041"/>
+                    </a:xfrm>
+                    <a:prstGeom prst="rect"/>
+                  </pic:spPr>
+                </pic:pic>
+              </a:graphicData>
+            </a:graphic>
+          </wp:inline>
+        </w:drawing>
+      </w:r>
+    </w:p>
+    <w:p>
+      <w:pPr>
+        <w:jc w:val="center"/>
+      </w:pPr>
+      <w:r>
+        <w:rPr>
+          <w:b w:val="0"/>
+          <w:i w:val="0"/>
+          <w:color w:val="55657A"/>
+          <w:sz w:val="17"/>
+        </w:rPr>
+        <w:t>Parte 2 de 2 · fin del diagrama</w:t>
+      </w:r>
+    </w:p>
+    <w:p>
+      <w:pPr>
+        <w:sectPr>
+          <w:pgSz w:w="15840" w:h="12240" w:orient="landscape"/>
+          <w:pgMar w:top="1020" w:right="850" w:bottom="907" w:left="850" w:header="720" w:footer="720" w:gutter="0"/>
+          <w:cols w:space="720"/>
+          <w:docGrid w:linePitch="360"/>
+        </w:sectPr>
+      </w:pPr>
+    </w:p>
+    <w:p>
+      <w:pPr>
+        <w:pStyle w:val="Heading2"/>
+      </w:pPr>
+      <w:r>
         <w:t>6.5 Registro de cambios</w:t>
+      </w:r>
+    </w:p>
+    <w:p>
+      <w:r>
+        <w:rPr>
+          <w:b w:val="0"/>
+          <w:i w:val="0"/>
+        </w:rPr>
+        <w:t>Para dar apoyo, el Administrador puede usar el selector **Ver como** (barra superior) y ver la herramienta con otro perfil. Es solo una vista: lo que hagas queda registrado con tu cuenta y el sistema sigue aplicando tus permisos reales.</w:t>
       </w:r>
     </w:p>
     <w:p>
@@ -3904,7 +4683,7 @@
                 <w:b w:val="0"/>
                 <w:sz w:val="19"/>
               </w:rPr>
-              <w:t>La solicitud que enviaste solo la puede revisar otra persona (en modo local de una sola persona se permite).</w:t>
+              <w:t>La solicitud que enviaste solo la puede revisar otra persona.</w:t>
             </w:r>
           </w:p>
         </w:tc>
@@ -4546,42 +5325,6 @@
                 <w:sz w:val="19"/>
               </w:rPr>
               <w:t>Corrige las filas indicadas en la vista previa y vuelve a subirlo. Hasta entonces no se importa nada.</w:t>
-            </w:r>
-          </w:p>
-        </w:tc>
-      </w:tr>
-      <w:tr>
-        <w:tc>
-          <w:tcPr>
-            <w:tcW w:type="dxa" w:w="3402"/>
-          </w:tcPr>
-          <w:p>
-            <w:pPr>
-              <w:spacing w:after="20"/>
-            </w:pPr>
-            <w:r>
-              <w:rPr>
-                <w:b w:val="0"/>
-                <w:sz w:val="19"/>
-              </w:rPr>
-              <w:t>Perdí lo que había cargado (modo local)</w:t>
-            </w:r>
-          </w:p>
-        </w:tc>
-        <w:tc>
-          <w:tcPr>
-            <w:tcW w:type="dxa" w:w="6009"/>
-          </w:tcPr>
-          <w:p>
-            <w:pPr>
-              <w:spacing w:after="20"/>
-            </w:pPr>
-            <w:r>
-              <w:rPr>
-                <w:b w:val="0"/>
-                <w:sz w:val="19"/>
-              </w:rPr>
-              <w:t>Los datos viven en ese navegador y computador. Cambiar de navegador o borrar datos de navegación los elimina.</w:t>
             </w:r>
           </w:p>
         </w:tc>
@@ -4946,8 +5689,6 @@
       </w:pPr>
     </w:p>
     <w:sectPr>
-      <w:headerReference w:type="default" r:id="rId9"/>
-      <w:footerReference w:type="default" r:id="rId10"/>
       <w:pgSz w:w="12240" w:h="15840"/>
       <w:pgMar w:top="1247" w:right="1247" w:bottom="1134" w:left="1247" w:header="720" w:footer="720" w:gutter="0"/>
       <w:cols w:space="720"/>
@@ -4969,7 +5710,7 @@
         <w:color w:val="55657A"/>
         <w:sz w:val="17"/>
       </w:rPr>
-      <w:t xml:space="preserve">Dirección General de Concesiones · División de Construcción · v10.15 · 2026-10-07 · Página </w:t>
+      <w:t xml:space="preserve">Dirección General de Concesiones · División de Construcción · v10.17 · 2026-10-07 · Página </w:t>
     </w:r>
     <w:r>
       <w:rPr>

</xml_diff>